<commit_message>
Archive ECL v0.1 DOI and publication route
</commit_message>
<xml_diff>
--- a/paper/jss/submission/ECL_JSS_cover_letter_v0_1.docx
+++ b/paper/jss/submission/ECL_JSS_cover_letter_v0_1.docx
@@ -24,7 +24,19 @@
         <w:pStyle w:val="BodyText"/>
       </w:pPr>
       <w:r>
-        <w:t xml:space="preserve">I am submitting the manuscript "ECL: A Deterministic Cross-Runtime Execution IR with Replayable Semantics and Dependency Interface" for consideration as a research article / software systems paper in The Journal of Systems and Software.</w:t>
+        <w:t xml:space="preserve">I am submitting the manuscript</w:t>
+      </w:r>
+      <w:r>
+        <w:t xml:space="preserve"> </w:t>
+      </w:r>
+      <w:r>
+        <w:t xml:space="preserve">“ECL: A Deterministic Cross-Runtime Execution IR with Replayable Semantics and Dependency Interface”</w:t>
+      </w:r>
+      <w:r>
+        <w:t xml:space="preserve"> </w:t>
+      </w:r>
+      <w:r>
+        <w:t xml:space="preserve">for consideration as a Research Paper in The Journal of Systems and Software.</w:t>
       </w:r>
     </w:p>
     <w:p>
@@ -48,7 +60,7 @@
         <w:pStyle w:val="BodyText"/>
       </w:pPr>
       <w:r>
-        <w:t xml:space="preserve">The manuscript is original, is not under consideration elsewhere, and is submitted with the author's approval. A preprint route through arXiv is prepared for visibility, but no journal submission has been performed before this package.</w:t>
+        <w:t xml:space="preserve">The manuscript is original, is not under consideration elsewhere, and is submitted with the author’s approval. A preprint route through arXiv is prepared for visibility, but no journal submission has been performed before this package.</w:t>
       </w:r>
     </w:p>
     <w:p>
@@ -72,7 +84,7 @@
         <w:pStyle w:val="BodyText"/>
       </w:pPr>
       <w:r>
-        <w:t xml:space="preserve">independent researcher</w:t>
+        <w:t xml:space="preserve">Independent Researcher</w:t>
       </w:r>
     </w:p>
     <w:bookmarkEnd w:id="9"/>

</xml_diff>